<commit_message>
Team 4 work added
</commit_message>
<xml_diff>
--- a/DOC-PPT-Study+matrials/PRAKASH_GOYEL_584341_NeoBank360_Handover_Document.docx
+++ b/DOC-PPT-Study+matrials/PRAKASH_GOYEL_584341_NeoBank360_Handover_Document.docx
@@ -3918,7 +3918,7 @@
         <w:tblLook w:val="0000" w:firstRow="0" w:lastRow="0" w:firstColumn="0" w:lastColumn="0" w:noHBand="0" w:noVBand="0"/>
       </w:tblPr>
       <w:tblGrid>
-        <w:gridCol w:w="10692"/>
+        <w:gridCol w:w="10784"/>
       </w:tblGrid>
       <w:tr>
         <w:trPr>
@@ -3981,19 +3981,11 @@
               <w:jc w:val="center"/>
             </w:pPr>
             <w:r>
-              <w:rPr>
-                <w:b/>
-                <w:bCs/>
-                <w:i/>
-                <w:iCs/>
-                <w:noProof/>
-                <w:color w:val="1F3864"/>
-              </w:rPr>
               <w:drawing>
-                <wp:inline distT="0" distB="0" distL="0" distR="0" wp14:anchorId="73E00C26" wp14:editId="009BD52C">
-                  <wp:extent cx="6484620" cy="2991485"/>
-                  <wp:effectExtent l="0" t="0" r="0" b="0"/>
-                  <wp:docPr id="955898530" name="Picture 1"/>
+                <wp:inline distT="0" distB="0" distL="0" distR="0" wp14:anchorId="3CA796FF" wp14:editId="4A61E1FF">
+                  <wp:extent cx="6545580" cy="3289300"/>
+                  <wp:effectExtent l="0" t="0" r="7620" b="6350"/>
+                  <wp:docPr id="1417088320" name="Picture 1"/>
                   <wp:cNvGraphicFramePr>
                     <a:graphicFrameLocks xmlns:a="http://schemas.openxmlformats.org/drawingml/2006/main" noChangeAspect="1"/>
                   </wp:cNvGraphicFramePr>
@@ -4001,7 +3993,7 @@
                     <a:graphicData uri="http://schemas.openxmlformats.org/drawingml/2006/picture">
                       <pic:pic xmlns:pic="http://schemas.openxmlformats.org/drawingml/2006/picture">
                         <pic:nvPicPr>
-                          <pic:cNvPr id="955898530" name=""/>
+                          <pic:cNvPr id="1417088320" name=""/>
                           <pic:cNvPicPr/>
                         </pic:nvPicPr>
                         <pic:blipFill>
@@ -4013,7 +4005,7 @@
                         <pic:spPr>
                           <a:xfrm>
                             <a:off x="0" y="0"/>
-                            <a:ext cx="6484620" cy="2991485"/>
+                            <a:ext cx="6545580" cy="3289300"/>
                           </a:xfrm>
                           <a:prstGeom prst="rect">
                             <a:avLst/>
@@ -10965,6 +10957,9 @@
           <w:p/>
           <w:p>
             <w:r>
+              <w:rPr>
+                <w:noProof/>
+              </w:rPr>
               <w:drawing>
                 <wp:inline distT="0" distB="0" distL="0" distR="0" wp14:anchorId="4828FAD1" wp14:editId="432E030B">
                   <wp:extent cx="6690360" cy="3244850"/>
@@ -11103,6 +11098,9 @@
           <w:p/>
           <w:p>
             <w:r>
+              <w:rPr>
+                <w:noProof/>
+              </w:rPr>
               <w:drawing>
                 <wp:inline distT="0" distB="0" distL="0" distR="0" wp14:anchorId="769840CE" wp14:editId="12E8AF50">
                   <wp:extent cx="6858000" cy="3002280"/>
@@ -11220,6 +11218,9 @@
           <w:p/>
           <w:p>
             <w:r>
+              <w:rPr>
+                <w:noProof/>
+              </w:rPr>
               <w:drawing>
                 <wp:inline distT="0" distB="0" distL="0" distR="0" wp14:anchorId="03F03870" wp14:editId="0DB3CFD6">
                   <wp:extent cx="6720840" cy="2651760"/>
@@ -11331,6 +11332,9 @@
           <w:p/>
           <w:p>
             <w:r>
+              <w:rPr>
+                <w:noProof/>
+              </w:rPr>
               <w:drawing>
                 <wp:inline distT="0" distB="0" distL="0" distR="0" wp14:anchorId="24263A78" wp14:editId="699DDAD8">
                   <wp:extent cx="6858000" cy="3256915"/>
@@ -11465,6 +11469,9 @@
           <w:p/>
           <w:p>
             <w:r>
+              <w:rPr>
+                <w:noProof/>
+              </w:rPr>
               <w:drawing>
                 <wp:inline distT="0" distB="0" distL="0" distR="0" wp14:anchorId="2D5B738E" wp14:editId="521A9A11">
                   <wp:extent cx="6690360" cy="1687195"/>
@@ -11504,6 +11511,9 @@
           </w:p>
           <w:p>
             <w:r>
+              <w:rPr>
+                <w:noProof/>
+              </w:rPr>
               <w:drawing>
                 <wp:inline distT="0" distB="0" distL="0" distR="0" wp14:anchorId="0A7DDD80" wp14:editId="42F95B76">
                   <wp:extent cx="6690360" cy="3225165"/>
@@ -11631,6 +11641,9 @@
           <w:p/>
           <w:p>
             <w:r>
+              <w:rPr>
+                <w:noProof/>
+              </w:rPr>
               <w:drawing>
                 <wp:inline distT="0" distB="0" distL="0" distR="0" wp14:anchorId="7913BD13" wp14:editId="054981BC">
                   <wp:extent cx="6858000" cy="3268980"/>
@@ -11733,6 +11746,9 @@
           <w:p/>
           <w:p>
             <w:r>
+              <w:rPr>
+                <w:noProof/>
+              </w:rPr>
               <w:drawing>
                 <wp:inline distT="0" distB="0" distL="0" distR="0" wp14:anchorId="46E0CA7A" wp14:editId="38C48FB3">
                   <wp:extent cx="6858000" cy="3291205"/>
@@ -11842,6 +11858,9 @@
           <w:p/>
           <w:p>
             <w:r>
+              <w:rPr>
+                <w:noProof/>
+              </w:rPr>
               <w:drawing>
                 <wp:inline distT="0" distB="0" distL="0" distR="0" wp14:anchorId="6579BF9D" wp14:editId="6525249C">
                   <wp:extent cx="6675120" cy="1836420"/>
@@ -11881,6 +11900,9 @@
           </w:p>
           <w:p>
             <w:r>
+              <w:rPr>
+                <w:noProof/>
+              </w:rPr>
               <w:drawing>
                 <wp:inline distT="0" distB="0" distL="0" distR="0" wp14:anchorId="42F13C26" wp14:editId="23397E06">
                   <wp:extent cx="6690360" cy="3093720"/>
@@ -11920,6 +11942,9 @@
           </w:p>
           <w:p>
             <w:r>
+              <w:rPr>
+                <w:noProof/>
+              </w:rPr>
               <w:drawing>
                 <wp:inline distT="0" distB="0" distL="0" distR="0" wp14:anchorId="4BCB6505" wp14:editId="6131FAA7">
                   <wp:extent cx="6697980" cy="2133600"/>
@@ -12033,6 +12058,9 @@
           <w:p/>
           <w:p>
             <w:r>
+              <w:rPr>
+                <w:noProof/>
+              </w:rPr>
               <w:drawing>
                 <wp:inline distT="0" distB="0" distL="0" distR="0" wp14:anchorId="7FE300E6" wp14:editId="42A68073">
                   <wp:extent cx="6858000" cy="3271520"/>
@@ -12135,6 +12163,9 @@
           <w:p/>
           <w:p>
             <w:r>
+              <w:rPr>
+                <w:noProof/>
+              </w:rPr>
               <w:drawing>
                 <wp:inline distT="0" distB="0" distL="0" distR="0" wp14:anchorId="00A13D09" wp14:editId="4120C5E0">
                   <wp:extent cx="6667500" cy="3498850"/>
@@ -12175,6 +12206,9 @@
           <w:p/>
           <w:p>
             <w:r>
+              <w:rPr>
+                <w:noProof/>
+              </w:rPr>
               <w:drawing>
                 <wp:inline distT="0" distB="0" distL="0" distR="0" wp14:anchorId="6C4C91C0" wp14:editId="508056EE">
                   <wp:extent cx="6858000" cy="3279140"/>
@@ -12276,6 +12310,9 @@
           <w:p/>
           <w:p>
             <w:r>
+              <w:rPr>
+                <w:noProof/>
+              </w:rPr>
               <w:drawing>
                 <wp:inline distT="0" distB="0" distL="0" distR="0" wp14:anchorId="2126AB0E" wp14:editId="637CF347">
                   <wp:extent cx="6858000" cy="3253740"/>
@@ -12381,6 +12418,9 @@
           <w:p/>
           <w:p>
             <w:r>
+              <w:rPr>
+                <w:noProof/>
+              </w:rPr>
               <w:drawing>
                 <wp:inline distT="0" distB="0" distL="0" distR="0" wp14:anchorId="2BBAC5E0" wp14:editId="3745DB52">
                   <wp:extent cx="6858000" cy="3288665"/>
@@ -12483,6 +12523,9 @@
           <w:p/>
           <w:p>
             <w:r>
+              <w:rPr>
+                <w:noProof/>
+              </w:rPr>
               <w:drawing>
                 <wp:inline distT="0" distB="0" distL="0" distR="0" wp14:anchorId="1B9A4EB3" wp14:editId="09C9FB4D">
                   <wp:extent cx="6858000" cy="3265805"/>

</xml_diff>